<commit_message>
Add character concordance and fix name inconsistencies across chapters
- Add utils/concordance.md listing all characters
- Unify Aimee Finch / Susannah Yo into Aimee Finch (Ch.1 pub name corrected, Ch.7 name corrected throughout)
- Unify Div / Dev into Div (Ch.6)
- Unify Jan / Pausing into Pausing (Ch.2)
- Unify Carlton / Preston into Preston (Ch.14)
</commit_message>
<xml_diff>
--- a/Chapter 6 - Dust.docx
+++ b/Chapter 6 - Dust.docx
@@ -704,7 +704,7 @@
         <w:rPr>
           <w:lang w:val="en-GB"/>
         </w:rPr>
-        <w:t xml:space="preserve">But as he locked the door, with the enormous key and wondered if it was going to fit in his trouser pocket, he caught sight of the bright green monstrosity that Dev had given him. Was it stolen? Technically, it was stolen. </w:t>
+        <w:t xml:space="preserve">But as he locked the door, with the enormous key and wondered if it was going to fit in his trouser pocket, he caught sight of the bright green monstrosity that Div had given him. Was it stolen? Technically, it was stolen. </w:t>
       </w:r>
     </w:p>
     <w:p>
@@ -780,7 +780,7 @@
         <w:rPr>
           <w:lang w:val="en-GB"/>
         </w:rPr>
-        <w:t xml:space="preserve"> this guy was plumbing the depths of the Glasgow coma scale. Eye opening? 1 - None. Verbal response? 1 - None. Physical response? 1 - None. And according to Dev, the reason was that he’d taken an unplanned journey through the windscreen of his lime green sex machine and</w:t>
+        <w:t xml:space="preserve"> this guy was plumbing the depths of the Glasgow coma scale. Eye opening? 1 - None. Verbal response? 1 - None. Physical response? 1 - None. And according to Div, the reason was that he’d taken an unplanned journey through the windscreen of his lime green sex machine and</w:t>
       </w:r>
       <w:r>
         <w:rPr>

</xml_diff>